<commit_message>
Libro III, cap. 22: cierre físico de Álvaro (la pantalla en negro); cap. 24: Lucía en un Ibiza
Co-Authored-By: Claude Opus 5.5 <noreply@anthropic.com>
Claude-Session: https://claude.ai/code/session_01HymiadRDUPzWBtequ8tm6m
</commit_message>
<xml_diff>
--- a/ada_koch/libro_3/El_hombre_de_arriba_acto3_borrador.docx
+++ b/ada_koch/libro_3/El_hombre_de_arriba_acto3_borrador.docx
@@ -1010,6 +1010,14 @@
         <w:pStyle w:val="BodyText"/>
       </w:pPr>
       <w:r>
+        <w:t xml:space="preserve">La funcionaria de la mesa pulsó una tecla sin levantar la vista, y la tele se apagó. Un punto de luz en el centro, un segundo, y luego negro. En el cristal oscuro se reflejaba la sala: la jueza, los bancos, la ventana, yo. Álvaro no se despidió. Nadie le había preguntado si quería.</w:t>
+      </w:r>
+    </w:p>
+    <w:p>
+      <w:pPr>
+        <w:pStyle w:val="BodyText"/>
+      </w:pPr>
+      <w:r>
         <w:t xml:space="preserve">La jueza dijo que la sentencia la tendrían las partes por escrito en unos días. Pero el abogado de oficio de Brais, el chico de Carballo que habla deprisa, me dijo en el pasillo, sin que yo le preguntara, que sería una multa. Seis meses, a diez euros al día. Y la indemnización por la nariz. Y los antecedentes.</w:t>
       </w:r>
     </w:p>
@@ -1802,7 +1810,7 @@
         <w:pStyle w:val="FirstParagraph"/>
       </w:pPr>
       <w:r>
-        <w:t xml:space="preserve">Lucía llegó el veinte de junio en un Clio de alquiler con el maletero lleno de cosas que no hacían falta: un flotador de unicornio, dos bolsas de embutido de León, una cafetera eléctrica «porque la tuya es del Pleistoceno», un ventilador, y Hugo.</w:t>
+        <w:t xml:space="preserve">Lucía llegó el veinte de junio en un Ibiza de alquiler con el maletero lleno de cosas que no hacían falta: un flotador de unicornio, dos bolsas de embutido de León, una cafetera eléctrica «porque la tuya es del Pleistoceno», un ventilador, y Hugo.</w:t>
       </w:r>
     </w:p>
     <w:p>

</xml_diff>

<commit_message>
Libro III, cap. 30: la higuera, junto a la tapia, en febrero
Co-Authored-By: Claude Opus 5.5 <noreply@anthropic.com>
Claude-Session: https://claude.ai/code/session_01HymiadRDUPzWBtequ8tm6m
</commit_message>
<xml_diff>
--- a/ada_koch/libro_3/El_hombre_de_arriba_acto3_borrador.docx
+++ b/ada_koch/libro_3/El_hombre_de_arriba_acto3_borrador.docx
@@ -8826,6 +8826,38 @@
       </w:pPr>
       <w:r>
         <w:t xml:space="preserve">Y cerró la nevera, y la vaca se movió un poco con el golpe, y el dibujo se quedó un poco torcido, y así se ha quedado.</w:t>
+      </w:r>
+    </w:p>
+    <w:p>
+      <w:pPr>
+        <w:pStyle w:val="BodyText"/>
+      </w:pPr>
+      <w:r>
+        <w:t xml:space="preserve">Luego miró la taza de los barcos en el alféizar, con la rama dentro y las tres hojas abiertas hacia la luz.</w:t>
+      </w:r>
+    </w:p>
+    <w:p>
+      <w:pPr>
+        <w:pStyle w:val="BodyText"/>
+      </w:pPr>
+      <w:r>
+        <w:t xml:space="preserve">—¿Y esa? —preguntó—. ¿Dónde la plantamos?</w:t>
+      </w:r>
+    </w:p>
+    <w:p>
+      <w:pPr>
+        <w:pStyle w:val="BodyText"/>
+      </w:pPr>
+      <w:r>
+        <w:t xml:space="preserve">No lo pensé.</w:t>
+      </w:r>
+    </w:p>
+    <w:p>
+      <w:pPr>
+        <w:pStyle w:val="BodyText"/>
+      </w:pPr>
+      <w:r>
+        <w:t xml:space="preserve">—Junto a la tapia, donde da el sol de la tarde —dije—. En febrero.</w:t>
       </w:r>
     </w:p>
     <w:p>

</xml_diff>